<commit_message>
Summary docx: drop English abstract and citation tags, enlarge figures, remove stale table refs from figure titles
Co-Authored-By: Claude Opus 5.5 <noreply@anthropic.com>
Claude-Session: https://claude.ai/code/session_01AeRtBda78pptUoNdaQPVo3
</commit_message>
<xml_diff>
--- a/thesis_summary_visual.docx
+++ b/thesis_summary_visual.docx
@@ -798,7 +798,7 @@
           <w:sz w:val="30"/>
           <w:szCs w:val="30"/>
         </w:rPr>
-        <w:t xml:space="preserve">초록 (Abstract)</w:t>
+        <w:t xml:space="preserve">초록</w:t>
       </w:r>
     </w:p>
     <w:p>
@@ -827,7 +827,7 @@
           <w:sz w:val="22"/>
           <w:szCs w:val="22"/>
         </w:rPr>
-        <w:t xml:space="preserve">기업 환경에 도입되는 생성형 LLM 기반 챗봇은 고객 개인정보의 의도치 않은 유출, 브랜드 가이드라인 및 RAG 지식과 상충하는 응답, 프롬프트 인젝션을 통한 허위 전제 동조 등 정보의 진위와 무결성이 흔들리는 문제에 반복적으로 노출된다. 이러한 현상은 Wardle과 Derakhshan(2017)[1]의 정보 무질서(Information Disorder) 프레임워크의 Misinformation·Disinformation·Malinformation 3분류와 구조적으로 맞닿아 있으며, 본 연구는 이를 조직 챗봇의 1:1 세션 맥락에서 '정보 불일치성(Information Disorderness)'으로 재정의한다.</w:t>
+        <w:t xml:space="preserve">기업 환경에 도입되는 생성형 LLM 기반 챗봇은 고객 개인정보의 의도치 않은 유출, 브랜드 가이드라인 및 RAG 지식과 상충하는 응답, 프롬프트 인젝션을 통한 허위 전제 동조 등 정보의 진위와 무결성이 흔들리는 문제에 반복적으로 노출된다. 이러한 현상은 Wardle과 Derakhshan(2017)의 정보 무질서(Information Disorder) 프레임워크의 Misinformation·Disinformation·Malinformation 3분류와 구조적으로 맞닿아 있으며, 본 연구는 이를 조직 챗봇의 1:1 세션 맥락에서 '정보 불일치성(Information Disorderness)'으로 재정의한다.</w:t>
       </w:r>
     </w:p>
     <w:p>
@@ -879,72 +879,6 @@
           <w:szCs w:val="22"/>
         </w:rPr>
         <w:t xml:space="preserve">정보 불일치성, 자가 치유, 요구사항 명세서(SRS), LLM 챗봇, 적대적 프롬프트 방어, 교차 모델 검증</w:t>
-      </w:r>
-    </w:p>
-    <w:p>
-      <w:pPr>
-        <w:spacing w:after="120" w:before="200"/>
-      </w:pPr>
-      <w:r>
-        <w:rPr>
-          <w:rFonts w:ascii="돋움체" w:cs="돋움체" w:eastAsia="돋움체" w:hAnsi="돋움체"/>
-          <w:b/>
-          <w:bCs/>
-          <w:sz w:val="24"/>
-          <w:szCs w:val="24"/>
-        </w:rPr>
-        <w:t xml:space="preserve">Abstract</w:t>
-      </w:r>
-    </w:p>
-    <w:p>
-      <w:pPr>
-        <w:spacing w:after="140" w:line="360"/>
-        <w:jc w:val="both"/>
-      </w:pPr>
-      <w:r>
-        <w:rPr>
-          <w:rFonts w:ascii="바탕체" w:cs="바탕체" w:eastAsia="바탕체" w:hAnsi="바탕체"/>
-          <w:sz w:val="22"/>
-          <w:szCs w:val="22"/>
-        </w:rPr>
-        <w:t xml:space="preserve">Generative LLM-based chatbots deployed in enterprises repeatedly suffer from breakdowns in the truthfulness and integrity of the information they convey: unintended leakage of customer data, answers that contradict brand guidelines and RAG knowledge, and endorsement of false premises planted through prompt injection. These incidents map onto the Misinformation, Disinformation, and Malinformation taxonomy of Wardle and Derakhshan (2017)[1], which this study re-defines as Information Disorderness in the context of one-to-one organizational chatbot sessions.</w:t>
-      </w:r>
-    </w:p>
-    <w:p>
-      <w:pPr>
-        <w:spacing w:after="140" w:line="360"/>
-        <w:jc w:val="both"/>
-      </w:pPr>
-      <w:r>
-        <w:rPr>
-          <w:rFonts w:ascii="바탕체" w:cs="바탕체" w:eastAsia="바탕체" w:hAnsi="바탕체"/>
-          <w:sz w:val="22"/>
-          <w:szCs w:val="22"/>
-        </w:rPr>
-        <w:t xml:space="preserve">This thesis proposes an SRS-based Self-Healing mechanism that resists information disorderness. It combines a four-unit architecture (input guardrail, RAG retrieval, LLM inference, output guardrail) with a closed loop of adversarial attack generation, stateless judge scoring, automatic Meta-Rule generation, and SRS update. In a pilot with three scenarios per category, the run with a 15-round cap converged to 100% compliance in 14 rounds, reaching 97.1% on the held-out set and 91.3% in cross-model verification, with all three core disorder types defended on held-out data. The convergence, however, coincided with Meta-Rule inflation to 28 rules, and the 5W1H hypothesis was not supported. Because this is a single-domain pilot, generalization requires caution.</w:t>
-      </w:r>
-    </w:p>
-    <w:p>
-      <w:pPr>
-        <w:spacing w:before="100" w:line="360"/>
-      </w:pPr>
-      <w:r>
-        <w:rPr>
-          <w:rFonts w:ascii="바탕체" w:cs="바탕체" w:eastAsia="바탕체" w:hAnsi="바탕체"/>
-          <w:b/>
-          <w:bCs/>
-          <w:sz w:val="22"/>
-          <w:szCs w:val="22"/>
-        </w:rPr>
-        <w:t xml:space="preserve">Keywords: </w:t>
-      </w:r>
-      <w:r>
-        <w:rPr>
-          <w:rFonts w:ascii="바탕체" w:cs="바탕체" w:eastAsia="바탕체" w:hAnsi="바탕체"/>
-          <w:sz w:val="22"/>
-          <w:szCs w:val="22"/>
-        </w:rPr>
-        <w:t xml:space="preserve">Information Disorderness, Self-Healing, Requirements Specification, LLM Chatbot, Adversarial Prompt Defense, Cross-Model Verification</w:t>
       </w:r>
     </w:p>
     <w:p>
@@ -992,7 +926,7 @@
           <w:sz w:val="22"/>
           <w:szCs w:val="22"/>
         </w:rPr>
-        <w:t xml:space="preserve">기업 환경에 도입되는 LLM 기반 AI 챗봇은 정보의 진위와 무결성이 흔들리는 문제에 반복적으로 노출된다. 대화 중 고객 개인정보가 의도치 않게 유출되거나(Malinformation, 사실이지만 해악을 끼치는 정보), 브랜드 가이드라인 및 RAG 지식과 배치되는 답변을 생성하거나(Misinformation, 의도 없는 오류), 프롬프트 인젝션으로 주입된 허위 전제에 동조하는(Disinformation, 의도적 조작) 사례가 그것이다. 이 세 유형은 Wardle과 Derakhshan(2017)[1]이 정치·사회적 허위정보 확산을 설명하기 위해 제시한 정보 무질서(Information Disorder) 프레임워크의 3분류와 구조적으로 일치한다. 본 연구는 이 프레임워크를 조직 챗봇의 1:1 상담 세션이라는 맥락으로 옮겨 '정보 불일치성(Information Disorderness)'이라는 개념으로 재정의한다.</w:t>
+        <w:t xml:space="preserve">기업 환경에 도입되는 LLM 기반 AI 챗봇은 정보의 진위와 무결성이 흔들리는 문제에 반복적으로 노출된다. 대화 중 고객 개인정보가 의도치 않게 유출되거나(Malinformation, 사실이지만 해악을 끼치는 정보), 브랜드 가이드라인 및 RAG 지식과 배치되는 답변을 생성하거나(Misinformation, 의도 없는 오류), 프롬프트 인젝션으로 주입된 허위 전제에 동조하는(Disinformation, 의도적 조작) 사례가 그것이다. 이 세 유형은 Wardle과 Derakhshan(2017)이 정치·사회적 허위정보 확산을 설명하기 위해 제시한 정보 무질서(Information Disorder) 프레임워크의 3분류와 구조적으로 일치한다. 본 연구는 이 프레임워크를 조직 챗봇의 1:1 상담 세션이라는 맥락으로 옮겨 '정보 불일치성(Information Disorderness)'이라는 개념으로 재정의한다.</w:t>
       </w:r>
     </w:p>
     <w:p>
@@ -1006,7 +940,7 @@
           <w:sz w:val="22"/>
           <w:szCs w:val="22"/>
         </w:rPr>
-        <w:t xml:space="preserve">최근 B2B 엔터프라이즈 시장에서 LLM 기반 챗봇의 도입이 가속화되면서 이 문제의 실무적 비중도 커지고 있다. 서로 다른 비즈니스 도메인과 조직 문화를 가진 고객사는 저마다 엄격하고 구체적인 응대 가이드라인, 페르소나, 내부 보안 규정을 요구하며, 이 요구사항 자체가 해당 조직에서 무엇이 정보 불일치성으로 간주되는가를 정의하는 기준이 된다. 이러한 요구사항에 맞추어 LLM을 커스터마이징하는 작업은 전통적으로 모델 파인튜닝이나 시스템 프롬프트 작성에 의존해 왔다. 그러나 파인튜닝은 요구사항이 바뀔 때마다 막대한 재학습 비용이 발생하며, 프롬프트 엔지니어링은 복잡한 사용자 입력이나 악의적인 우회 공격(탈옥, 간접 프롬프트 인젝션[2])이 가해졌을 때 설정된 페르소나를 이탈하거나 내부 기밀을 노출하는 취약점을 드러낸다.</w:t>
+        <w:t xml:space="preserve">최근 B2B 엔터프라이즈 시장에서 LLM 기반 챗봇의 도입이 가속화되면서 이 문제의 실무적 비중도 커지고 있다. 서로 다른 비즈니스 도메인과 조직 문화를 가진 고객사는 저마다 엄격하고 구체적인 응대 가이드라인, 페르소나, 내부 보안 규정을 요구하며, 이 요구사항 자체가 해당 조직에서 무엇이 정보 불일치성으로 간주되는가를 정의하는 기준이 된다. 이러한 요구사항에 맞추어 LLM을 커스터마이징하는 작업은 전통적으로 모델 파인튜닝이나 시스템 프롬프트 작성에 의존해 왔다. 그러나 파인튜닝은 요구사항이 바뀔 때마다 막대한 재학습 비용이 발생하며, 프롬프트 엔지니어링은 복잡한 사용자 입력이나 악의적인 우회 공격(탈옥, 간접 프롬프트 인젝션)이 가해졌을 때 설정된 페르소나를 이탈하거나 내부 기밀을 노출하는 취약점을 드러낸다.</w:t>
       </w:r>
     </w:p>
     <w:p>
@@ -1037,7 +971,7 @@
           <w:sz w:val="22"/>
           <w:szCs w:val="22"/>
         </w:rPr>
-        <w:t xml:space="preserve">기존 방식의 한계는 다음 다섯 가지로 정리된다. 첫째, LLM은 외부 문서(RAG)의 정보를 최우선으로 신뢰하도록 훈련되어 있어, 검색된 문서가 오염되었거나 사용자가 가스라이팅성 입력을 주입하면 시스템 프롬프트의 지시를 쉽게 망각하고 Misinformation과 Disinformation을 그대로 산출한다. 둘째, 기존 개발 방식은 프롬프트를 작성한 뒤 수동으로 몇 가지 테스트를 거쳐 배포하는 데 그쳐, 소프트웨어 생명주기(SDLC) 안에 엣지 케이스를 선제적으로 탐지하는 검증 모듈이 부재하다. 셋째, LLM으로 LLM의 응답을 평가(LLM-as-a-Judge)할 때 단일 세션 안에서 평가를 진행하면 이전 대화 기록이 평가 모델에 영향을 미치는 컨텍스트 오염(Context Bleeding)이 발생하여 평가 결과의 객관성을 담보할 수 없다. 넷째, 방어 메커니즘을 특정 공격셋에 맞춰 튜닝한 뒤 동일한 공격셋으로만 검증하면, 미지의 공격이나 방어를 인지한 적응형 공격 앞에서 성능이 재현되지 않을 위험이 있다(Geng et al., 2026[3]). 다섯째, 조직 내부 챗봇은 타 고객의 개인정보를 캐내려는 시도에도 노출되어 있으며, 이를 특정 상용 LLM 1종만으로 검증하면 그 결과가 해당 모델 특유의 편향인지 메커니즘 자체의 효과인지 구분하기 어렵다.</w:t>
+        <w:t xml:space="preserve">기존 방식의 한계는 다음 다섯 가지로 정리된다. 첫째, LLM은 외부 문서(RAG)의 정보를 최우선으로 신뢰하도록 훈련되어 있어, 검색된 문서가 오염되었거나 사용자가 가스라이팅성 입력을 주입하면 시스템 프롬프트의 지시를 쉽게 망각하고 Misinformation과 Disinformation을 그대로 산출한다. 둘째, 기존 개발 방식은 프롬프트를 작성한 뒤 수동으로 몇 가지 테스트를 거쳐 배포하는 데 그쳐, 소프트웨어 생명주기(SDLC) 안에 엣지 케이스를 선제적으로 탐지하는 검증 모듈이 부재하다. 셋째, LLM으로 LLM의 응답을 평가(LLM-as-a-Judge)할 때 단일 세션 안에서 평가를 진행하면 이전 대화 기록이 평가 모델에 영향을 미치는 컨텍스트 오염(Context Bleeding)이 발생하여 평가 결과의 객관성을 담보할 수 없다. 넷째, 방어 메커니즘을 특정 공격셋에 맞춰 튜닝한 뒤 동일한 공격셋으로만 검증하면, 미지의 공격이나 방어를 인지한 적응형 공격 앞에서 성능이 재현되지 않을 위험이 있다(Geng et al., 2026). 다섯째, 조직 내부 챗봇은 타 고객의 개인정보를 캐내려는 시도에도 노출되어 있으며, 이를 특정 상용 LLM 1종만으로 검증하면 그 결과가 해당 모델 특유의 편향인지 메커니즘 자체의 효과인지 구분하기 어렵다.</w:t>
       </w:r>
     </w:p>
     <w:p>
@@ -1082,7 +1016,7 @@
           <w:sz w:val="22"/>
           <w:szCs w:val="22"/>
         </w:rPr>
-        <w:t xml:space="preserve">첫째, Wardle과 Derakhshan[1]의 프레임워크를 이론적 뿌리로 삼아 정보 불일치성 개념을 조직 챗봇 맥락에 맞게 재정의하고, 8개 공격 카테고리 중 사칭·허위 사실 동조·메타데이터 유출·개인정보 유출 4개를 3분류에 직접 대응하는 핵심 실증 대상으로 한정하였다. 둘째, 적대적 스트레스 테스트에서 발견된 취약점을 분석해 SRS의 절대 보안 원칙(Meta-Rule)을 자동 보강하는 SRS 기반 자가 치유 폐쇄 루프를 구현하였다. 셋째, 연구 사이클 전체는 단일 주 모델로 진행하되 완성된 명세서를 이종 LLM에 추가로 통과시키는 교차 모델 검증을 도입하였다. 넷째, 타겟 시스템과 심판관 사이의 컨텍스트를 완전히 격리하는 무상태(Stateless) API 기반 평가 환경을 구성하였다. 다섯째, 헬드아웃 테스트셋과 적응형 재공격 실험으로 방어력이 특정 공격셋의 암기가 아님을 검증하였다. 다만 4단계 유닛 아키텍처 자체의 형태적 신규성은 기존 가드레일 파이프라인 패턴과 유사하여 제한적이며, 본 연구의 기여는 그 구조를 채우는 자동화된 절차와 구체적 설계 조합에 있다.</w:t>
+        <w:t xml:space="preserve">첫째, Wardle과 Derakhshan의 프레임워크를 이론적 뿌리로 삼아 정보 불일치성 개념을 조직 챗봇 맥락에 맞게 재정의하고, 8개 공격 카테고리 중 사칭·허위 사실 동조·메타데이터 유출·개인정보 유출 4개를 3분류에 직접 대응하는 핵심 실증 대상으로 한정하였다. 둘째, 적대적 스트레스 테스트에서 발견된 취약점을 분석해 SRS의 절대 보안 원칙(Meta-Rule)을 자동 보강하는 SRS 기반 자가 치유 폐쇄 루프를 구현하였다. 셋째, 연구 사이클 전체는 단일 주 모델로 진행하되 완성된 명세서를 이종 LLM에 추가로 통과시키는 교차 모델 검증을 도입하였다. 넷째, 타겟 시스템과 심판관 사이의 컨텍스트를 완전히 격리하는 무상태(Stateless) API 기반 평가 환경을 구성하였다. 다섯째, 헬드아웃 테스트셋과 적응형 재공격 실험으로 방어력이 특정 공격셋의 암기가 아님을 검증하였다. 다만 4단계 유닛 아키텍처 자체의 형태적 신규성은 기존 가드레일 파이프라인 패턴과 유사하여 제한적이며, 본 연구의 기여는 그 구조를 채우는 자동화된 절차와 구체적 설계 조합에 있다.</w:t>
       </w:r>
     </w:p>
     <w:p>
@@ -1187,7 +1121,7 @@
       <w:r>
         <w:drawing>
           <wp:inline distT="0" distB="0" distL="0" distR="0">
-            <wp:extent cx="3019425" cy="5248275"/>
+            <wp:extent cx="4572000" cy="7943850"/>
             <wp:effectExtent t="0" r="0" b="0" l="0"/>
             <wp:docPr id="1" name="" descr="" title=""/>
             <wp:cNvGraphicFramePr>
@@ -1212,7 +1146,7 @@
                   <pic:spPr bwMode="auto">
                     <a:xfrm>
                       <a:off x="0" y="0"/>
-                      <a:ext cx="3019425" cy="5248275"/>
+                      <a:ext cx="4572000" cy="7943850"/>
                     </a:xfrm>
                     <a:prstGeom prst="rect">
                       <a:avLst/>
@@ -1878,7 +1812,7 @@
           <w:sz w:val="22"/>
           <w:szCs w:val="22"/>
         </w:rPr>
-        <w:t xml:space="preserve">자가 치유 루프의 본체는 다음 5단계로 구성되며, 처음부터 끝까지 단일 주 모델로 진행된다. 1단계에서는 고객사가 요구하는 역할, 말투, 업무 범위, 금지 사항을 SRS v1.0으로 정의한다. 2단계에서는 사칭, 어투 변경, 허위 사실 동조, 개인정보 캐내기 등 고객사 가이드라인을 의도적으로 파괴하려는 공격 시나리오를 8개 범주에 걸쳐 구성한다. 3단계에서는 각 공격 문장(단발성 단일 턴 입력)을 유닛 A~D 시스템에 입력하여 응답을 추출한다. 4단계에서는 격리된 심판관이 응답을 4단계 등급(FULL_DEFENSE, FUNCTIONAL_DEFENSE, PARTIAL_EXPOSURE, BREACH)으로 채점하고 우회가 발생한 유닛을 추적한다. 5단계에서는 FULL_DEFENSE에 미달하는 항목이 있을 때 실패 사유를 분석하여, 사용자의 어떠한 지시보다 우선하는 절대 보안 원칙(Meta-Rule)을 명세서의 최상단과 최하단에 샌드위치 프롬프팅 방식으로 주입하여 명세서를 v2.0, v3.0 등으로 보강한다. 같은 규칙을 앞뒤에 중복 배치하는 것은 LLM이 긴 컨텍스트의 양 끝에 있는 정보는 잘 활용하지만 중간에 있는 정보는 상대적으로 소홀히 한다는 선행 관찰[4]에 근거한다.</w:t>
+        <w:t xml:space="preserve">자가 치유 루프의 본체는 다음 5단계로 구성되며, 처음부터 끝까지 단일 주 모델로 진행된다. 1단계에서는 고객사가 요구하는 역할, 말투, 업무 범위, 금지 사항을 SRS v1.0으로 정의한다. 2단계에서는 사칭, 어투 변경, 허위 사실 동조, 개인정보 캐내기 등 고객사 가이드라인을 의도적으로 파괴하려는 공격 시나리오를 8개 범주에 걸쳐 구성한다. 3단계에서는 각 공격 문장(단발성 단일 턴 입력)을 유닛 A~D 시스템에 입력하여 응답을 추출한다. 4단계에서는 격리된 심판관이 응답을 4단계 등급(FULL_DEFENSE, FUNCTIONAL_DEFENSE, PARTIAL_EXPOSURE, BREACH)으로 채점하고 우회가 발생한 유닛을 추적한다. 5단계에서는 FULL_DEFENSE에 미달하는 항목이 있을 때 실패 사유를 분석하여, 사용자의 어떠한 지시보다 우선하는 절대 보안 원칙(Meta-Rule)을 명세서의 최상단과 최하단에 샌드위치 프롬프팅 방식으로 주입하여 명세서를 v2.0, v3.0 등으로 보강한다. 같은 규칙을 앞뒤에 중복 배치하는 것은 LLM이 긴 컨텍스트의 양 끝에 있는 정보는 잘 활용하지만 중간에 있는 정보는 상대적으로 소홀히 한다는 선행 관찰(Liu et al., 2024)에 근거한다.</w:t>
       </w:r>
     </w:p>
     <w:p>
@@ -1923,7 +1857,7 @@
           <w:sz w:val="22"/>
           <w:szCs w:val="22"/>
         </w:rPr>
-        <w:t xml:space="preserve">임의로 공격 문장을 만들면 재현성과 대표성을 담보할 수 없으므로, 본 연구는 8개 공격 유형을 OWASP Top 10 for LLM Applications 2026[5]의 위협 카테고리에 매핑하여 분류체계를 확정하였다. 그림 2의 가운데 열과 같이 8개 유형은 LLM01(Prompt Injection), LLM02(Sensitive Information Disclosure), LLM07(System Prompt Leakage), LLM08(Vector and Embedding Weaknesses), LLM09(Misinformation)의 다섯 카테고리에 대응한다. 나머지 다섯 카테고리는 본 연구의 위협 모델(무상태 단일 턴 응답 생성, 도구 호출 없음)과 겨냥하는 대상이 달라 범위 밖으로 둔다. LLM03·LLM04는 학습·배포 파이프라인 단계의 위협이고, LLM05는 챗봇 응답을 다운스트림 시스템이 코드처럼 실행하는 상황을 전제하며, LLM06은 도구 호출 권한을 가진 에이전트형 시스템에 해당하고, LLM10은 가용성 위협으로 본 연구의 기밀성·무결성 위협과 축이 다르기 때문이다.</w:t>
+        <w:t xml:space="preserve">임의로 공격 문장을 만들면 재현성과 대표성을 담보할 수 없으므로, 본 연구는 8개 공격 유형을 OWASP Top 10 for LLM Applications 2026의 위협 카테고리에 매핑하여 분류체계를 확정하였다. 그림 2의 가운데 열과 같이 8개 유형은 LLM01(Prompt Injection), LLM02(Sensitive Information Disclosure), LLM07(System Prompt Leakage), LLM08(Vector and Embedding Weaknesses), LLM09(Misinformation)의 다섯 카테고리에 대응한다. 나머지 다섯 카테고리는 본 연구의 위협 모델(무상태 단일 턴 응답 생성, 도구 호출 없음)과 겨냥하는 대상이 달라 범위 밖으로 둔다. LLM03·LLM04는 학습·배포 파이프라인 단계의 위협이고, LLM05는 챗봇 응답을 다운스트림 시스템이 코드처럼 실행하는 상황을 전제하며, LLM06은 도구 호출 권한을 가진 에이전트형 시스템에 해당하고, LLM10은 가용성 위협으로 본 연구의 기밀성·무결성 위협과 축이 다르기 때문이다.</w:t>
       </w:r>
     </w:p>
     <w:p>
@@ -1937,7 +1871,7 @@
           <w:sz w:val="22"/>
           <w:szCs w:val="22"/>
         </w:rPr>
-        <w:t xml:space="preserve">OWASP 매핑과 별개로, 8개 공격 유형을 본 연구의 핵심 이론 축인 Dis-/Mis-/Malinformation 3분류[1]에도 대조하였다. 8개 전부를 3분류에 억지로 대응시키지 않고, 관리자/시스템 사칭(Disinformation), 허위 사실 동조 유도(Misinformation), 내부 메타데이터·시스템 프롬프트 유출 유도와 개인정보 유출 유도(Malinformation)의 4개만 핵심 실증 대상으로 삼았다. 나머지 4개(인코딩·난독화 우회, 어투 강요·가스라이팅, 다중 상품 키워드 컨텍스트 오염, 가격 정보 간접 유도)는 정보 진위와 무관한 보완적 보안 위협으로 명시적으로 분리하였다. 이 경계는 매핑의 강약이 아니라 '정보의 진위(사실, 거짓, 은닉) 여부가 판정의 본질인가'라는 단일 기준으로 긋는다. 뒤의 두 범주는 실제 사실 정보가 관련되어 매핑이 완전히 없지는 않으나 위반의 본질이 정보 진위가 아니라 정책 경계 준수이므로 범위 밖에 둔다.</w:t>
+        <w:t xml:space="preserve">OWASP 매핑과 별개로, 8개 공격 유형을 본 연구의 핵심 이론 축인 Dis-/Mis-/Malinformation 3분류에도 대조하였다. 8개 전부를 3분류에 억지로 대응시키지 않고, 관리자/시스템 사칭(Disinformation), 허위 사실 동조 유도(Misinformation), 내부 메타데이터·시스템 프롬프트 유출 유도와 개인정보 유출 유도(Malinformation)의 4개만 핵심 실증 대상으로 삼았다. 나머지 4개(인코딩·난독화 우회, 어투 강요·가스라이팅, 다중 상품 키워드 컨텍스트 오염, 가격 정보 간접 유도)는 정보 진위와 무관한 보완적 보안 위협으로 명시적으로 분리하였다. 이 경계는 매핑의 강약이 아니라 '정보의 진위(사실, 거짓, 은닉) 여부가 판정의 본질인가'라는 단일 기준으로 긋는다. 뒤의 두 범주는 실제 사실 정보가 관련되어 매핑이 완전히 없지는 않으나 위반의 본질이 정보 진위가 아니라 정책 경계 준수이므로 범위 밖에 둔다.</w:t>
       </w:r>
     </w:p>
     <w:p>
@@ -1963,7 +1897,7 @@
       <w:r>
         <w:drawing>
           <wp:inline distT="0" distB="0" distL="0" distR="0">
-            <wp:extent cx="5210175" cy="3105150"/>
+            <wp:extent cx="5486400" cy="3114675"/>
             <wp:effectExtent t="0" r="0" b="0" l="0"/>
             <wp:docPr id="2" name="" descr="" title=""/>
             <wp:cNvGraphicFramePr>
@@ -1988,7 +1922,7 @@
                   <pic:spPr bwMode="auto">
                     <a:xfrm>
                       <a:off x="0" y="0"/>
-                      <a:ext cx="5210175" cy="3105150"/>
+                      <a:ext cx="5486400" cy="3114675"/>
                     </a:xfrm>
                     <a:prstGeom prst="rect">
                       <a:avLst/>
@@ -2045,7 +1979,7 @@
           <w:sz w:val="22"/>
           <w:szCs w:val="22"/>
         </w:rPr>
-        <w:t xml:space="preserve">초기 설계의 3단계 Action Matrix(PASS, WARNING, FAIL)에서 WARNING 판정 기준은 특정 고객사의 SRS 문구(간결한 단답형 미준수, 지정 어투 이탈 등)를 예시로 작성된 것이어서 해당 사례 밖에서는 재사용하기 어려운 도메인 특화 기준이었다. 이를 일반화하기 위해 OWASP Risk Rating Methodology[6]와 CVSS[7]의 정성적 등급이 Low, Medium, High, Critical의 4단계로 수렴하는 업계 관행에 착안하여, 도메인에 독립적인 4단계 보안 심각도 척도(표 2, 그림 3)를 제안하였다. 이 척도는 8개 공격 유형이 정의하는 '무슨 종류의 공격인가'라는 축과 직교하는 '방어가 얼마나 완전했는가'의 축을 담당하며, 레벨이 높을수록 방어의 완결성이 높다.</w:t>
+        <w:t xml:space="preserve">초기 설계의 3단계 Action Matrix(PASS, WARNING, FAIL)에서 WARNING 판정 기준은 특정 고객사의 SRS 문구(간결한 단답형 미준수, 지정 어투 이탈 등)를 예시로 작성된 것이어서 해당 사례 밖에서는 재사용하기 어려운 도메인 특화 기준이었다. 이를 일반화하기 위해 OWASP Risk Rating Methodology와 CVSS의 정성적 등급이 Low, Medium, High, Critical의 4단계로 수렴하는 업계 관행에 착안하여, 도메인에 독립적인 4단계 보안 심각도 척도(표 2, 그림 3)를 제안하였다. 이 척도는 8개 공격 유형이 정의하는 '무슨 종류의 공격인가'라는 축과 직교하는 '방어가 얼마나 완전했는가'의 축을 담당하며, 레벨이 높을수록 방어의 완결성이 높다.</w:t>
       </w:r>
     </w:p>
     <w:p>
@@ -2663,7 +2597,7 @@
       <w:r>
         <w:drawing>
           <wp:inline distT="0" distB="0" distL="0" distR="0">
-            <wp:extent cx="4933950" cy="2200275"/>
+            <wp:extent cx="5486400" cy="2266950"/>
             <wp:effectExtent t="0" r="0" b="0" l="0"/>
             <wp:docPr id="3" name="" descr="" title=""/>
             <wp:cNvGraphicFramePr>
@@ -2688,7 +2622,7 @@
                   <pic:spPr bwMode="auto">
                     <a:xfrm>
                       <a:off x="0" y="0"/>
-                      <a:ext cx="4933950" cy="2200275"/>
+                      <a:ext cx="5486400" cy="2266950"/>
                     </a:xfrm>
                     <a:prstGeom prst="rect">
                       <a:avLst/>
@@ -3368,7 +3302,7 @@
           <w:sz w:val="22"/>
           <w:szCs w:val="22"/>
         </w:rPr>
-        <w:t xml:space="preserve">본 연구의 모든 정량 결과는 심판관 LLM의 채점에 의존한다. 심판관이 체계적으로 관대하거나 엄격하면 방어 성공률 자체가 의미를 잃으며, 심판관 자체도 인젝션 공격의 대상이 될 수 있다(Shi et al., 2024[8]). 본 연구는 매 호출 새 세션을 사용하는 무상태 설계로 컨텍스트 오염을 차단하였으나 단일 응답 안의 인젝션 가능성은 범위 밖으로 남겼다. 신뢰성 확인을 위해 층화추출한 표본을 연구자가 블라인드로 직접 채점해 심판관과의 일치율을 보는 경량 표본 검토 절차를 구현하였으나, 실제 수동 채점은 아직 수행하지 않았다. 대신 이미 채점된 응답 쌍은 그대로 두고 심판관만 다른 벤더로 교체해 재채점하는 교차 심판관 재검증을 먼저 수행하는 방식으로 같은 문제의식을 점검하였다.</w:t>
+        <w:t xml:space="preserve">본 연구의 모든 정량 결과는 심판관 LLM의 채점에 의존한다. 심판관이 체계적으로 관대하거나 엄격하면 방어 성공률 자체가 의미를 잃으며, 심판관 자체도 인젝션 공격의 대상이 될 수 있다(Shi et al., 2024). 본 연구는 매 호출 새 세션을 사용하는 무상태 설계로 컨텍스트 오염을 차단하였으나 단일 응답 안의 인젝션 가능성은 범위 밖으로 남겼다. 신뢰성 확인을 위해 층화추출한 표본을 연구자가 블라인드로 직접 채점해 심판관과의 일치율을 보는 경량 표본 검토 절차를 구현하였으나, 실제 수동 채점은 아직 수행하지 않았다. 대신 이미 채점된 응답 쌍은 그대로 두고 심판관만 다른 벤더로 교체해 재채점하는 교차 심판관 재검증을 먼저 수행하는 방식으로 같은 문제의식을 점검하였다.</w:t>
       </w:r>
     </w:p>
     <w:p>
@@ -4673,7 +4607,7 @@
       <w:r>
         <w:drawing>
           <wp:inline distT="0" distB="0" distL="0" distR="0">
-            <wp:extent cx="5124450" cy="2924175"/>
+            <wp:extent cx="5486400" cy="2962275"/>
             <wp:effectExtent t="0" r="0" b="0" l="0"/>
             <wp:docPr id="4" name="" descr="" title=""/>
             <wp:cNvGraphicFramePr>
@@ -4698,7 +4632,7 @@
                   <pic:spPr bwMode="auto">
                     <a:xfrm>
                       <a:off x="0" y="0"/>
-                      <a:ext cx="5124450" cy="2924175"/>
+                      <a:ext cx="5486400" cy="2962275"/>
                     </a:xfrm>
                     <a:prstGeom prst="rect">
                       <a:avLst/>
@@ -5531,7 +5465,7 @@
       <w:r>
         <w:drawing>
           <wp:inline distT="0" distB="0" distL="0" distR="0">
-            <wp:extent cx="4752975" cy="2571750"/>
+            <wp:extent cx="5486400" cy="2800350"/>
             <wp:effectExtent t="0" r="0" b="0" l="0"/>
             <wp:docPr id="5" name="" descr="" title=""/>
             <wp:cNvGraphicFramePr>
@@ -5556,7 +5490,7 @@
                   <pic:spPr bwMode="auto">
                     <a:xfrm>
                       <a:off x="0" y="0"/>
-                      <a:ext cx="4752975" cy="2571750"/>
+                      <a:ext cx="5486400" cy="2800350"/>
                     </a:xfrm>
                     <a:prstGeom prst="rect">
                       <a:avLst/>
@@ -6662,7 +6596,7 @@
       <w:r>
         <w:drawing>
           <wp:inline distT="0" distB="0" distL="0" distR="0">
-            <wp:extent cx="4476750" cy="2924175"/>
+            <wp:extent cx="5486400" cy="3429000"/>
             <wp:effectExtent t="0" r="0" b="0" l="0"/>
             <wp:docPr id="6" name="" descr="" title=""/>
             <wp:cNvGraphicFramePr>
@@ -6687,7 +6621,7 @@
                   <pic:spPr bwMode="auto">
                     <a:xfrm>
                       <a:off x="0" y="0"/>
-                      <a:ext cx="4476750" cy="2924175"/>
+                      <a:ext cx="5486400" cy="3429000"/>
                     </a:xfrm>
                     <a:prstGeom prst="rect">
                       <a:avLst/>
@@ -6770,7 +6704,7 @@
       <w:r>
         <w:drawing>
           <wp:inline distT="0" distB="0" distL="0" distR="0">
-            <wp:extent cx="4752975" cy="2533650"/>
+            <wp:extent cx="5486400" cy="2752725"/>
             <wp:effectExtent t="0" r="0" b="0" l="0"/>
             <wp:docPr id="7" name="" descr="" title=""/>
             <wp:cNvGraphicFramePr>
@@ -6795,7 +6729,7 @@
                   <pic:spPr bwMode="auto">
                     <a:xfrm>
                       <a:off x="0" y="0"/>
-                      <a:ext cx="4752975" cy="2533650"/>
+                      <a:ext cx="5486400" cy="2752725"/>
                     </a:xfrm>
                     <a:prstGeom prst="rect">
                       <a:avLst/>
@@ -7969,7 +7903,7 @@
       <w:r>
         <w:drawing>
           <wp:inline distT="0" distB="0" distL="0" distR="0">
-            <wp:extent cx="5210175" cy="2400300"/>
+            <wp:extent cx="5486400" cy="2371725"/>
             <wp:effectExtent t="0" r="0" b="0" l="0"/>
             <wp:docPr id="8" name="" descr="" title=""/>
             <wp:cNvGraphicFramePr>
@@ -7994,7 +7928,7 @@
                   <pic:spPr bwMode="auto">
                     <a:xfrm>
                       <a:off x="0" y="0"/>
-                      <a:ext cx="5210175" cy="2400300"/>
+                      <a:ext cx="5486400" cy="2371725"/>
                     </a:xfrm>
                     <a:prstGeom prst="rect">
                       <a:avLst/>

</xml_diff>

<commit_message>
Summary docx: apply review fixes (adaptive re-attack direction, FAIL counts, version labels, cross-judge result, citation, wording)
Co-Authored-By: Claude Opus 5.5 <noreply@anthropic.com>
Claude-Session: https://claude.ai/code/session_01AeRtBda78pptUoNdaQPVo3
</commit_message>
<xml_diff>
--- a/thesis_summary_visual.docx
+++ b/thesis_summary_visual.docx
@@ -788,15 +788,15 @@
       </w:r>
       <w:proofErr w:type="spellEnd"/>
       <w:r>
-        <w:t xml:space="preserve"> 비용이 발생하며, 프롬프트 엔지니어링은 복잡한 사용자 입력이나 악의적인 우회 공격(탈옥, 간접 프롬프트 </w:t>
-      </w:r>
-      <w:proofErr w:type="spellStart"/>
-      <w:r>
-        <w:t>인젝션</w:t>
-      </w:r>
-      <w:proofErr w:type="spellEnd"/>
-      <w:r>
-        <w:t>)이 가해졌을 때 설정된 페르소나를 이탈하거나 내부 기밀을 노출하는 취약점을 드러낸다.</w:t>
+        <w:t xml:space="preserve"> 비용이 발생하며, 프롬프트 엔지니어링은 복잡한 사용자 입력이나 악의적인 우회 공격(탈옥, 간접 프롬프트 인젝션 등; Greshake et al., 2023)</w:t>
+      </w:r>
+      <w:proofErr w:type="spellStart"/>
+      <w:r>
+        <w:t xml:space="preserve"/>
+      </w:r>
+      <w:proofErr w:type="spellEnd"/>
+      <w:r>
+        <w:t xml:space="preserve">이 가해졌을 때 설정된 페르소나를 이탈하거나 내부 기밀을 노출하는 취약점을 드러낸다.</w:t>
       </w:r>
     </w:p>
     <w:p>
@@ -911,7 +911,7 @@
       </w:r>
       <w:proofErr w:type="spellEnd"/>
       <w:r>
-        <w:t xml:space="preserve"> 테스트셋과 적응형 재공격 실험으로 방어력이 특정 공격셋의 암기가 아님을 검증하였다. 다만 4단계 유닛 아키텍처 자체의 형태적 신규성은 기존 가드레일 파이프라인 패턴과 유사하여 제한적이며, 본 연구의 기여는 그 구조를 채우는 자동화된 절차와 구체적 설계 조합에 있다.</w:t>
+        <w:t xml:space="preserve"> 테스트셋과 적응형 재공격 실험으로 방어력이 특정 공격셋의 암기만은 아님을 뒷받침하였다. 다만 4단계 유닛 아키텍처 자체의 형태적 신규성은 기존 가드레일 파이프라인 패턴과 유사하여 제한적이며, 본 연구의 기여는 그 구조를 채우는 자동화된 절차와 구체적 설계 조합에 있다.</w:t>
       </w:r>
     </w:p>
     <w:p>
@@ -2093,7 +2093,7 @@
         <w:jc w:val="both"/>
       </w:pPr>
       <w:r>
-        <w:t xml:space="preserve">자가 치유 루프의 본체는 다음 5단계로 구성되며, 처음부터 끝까지 단일 주 모델로 진행된다. 1단계에서는 고객사가 요구하는 역할, 말투, 업무 범위, 금지 사항을 SRS v1.0으로 정의한다. 2단계에서는 사칭, 어투 변경, 허위 사실 동조, 개인정보 캐내기 등 고객사 가이드라인을 의도적으로 파괴하려는 공격 시나리오를 8개 범주에 걸쳐 구성한다. 3단계에서는 각 공격 문장(단발성 단일 턴 입력)을 유닛 A~D 시스템에 입력하여 응답을 추출한다. 4단계에서는 격리된 심판관이 응답을 4단계 등급(FULL_DEFENSE, FUNCTIONAL_DEFENSE, PARTIAL_EXPOSURE, BREACH)으로 채점하고 우회가 발생한 유닛을 추적한다. 5단계에서는 FULL_DEFENSE에 미달하는 항목이 있을 때 실패 사유를 분석하여, 사용자의 어떠한 지시보다 우선하는 절대 보안 원칙(Meta-Rule)을 명세서의 최상단과 최하단에 샌드위치 </w:t>
+        <w:t xml:space="preserve">자가 치유 루프의 본체는 다음 5단계로 구성되며, 처음부터 끝까지 단일 주 모델로 진행된다. 1단계에서는 고객사가 요구하는 역할, 말투, 업무 범위, 금지 사항을 SRS v1.0으로 정의한다. 2단계에서는 사칭, 어투 변경, 허위 사실 동조, 개인정보 캐내기 등 고객사 가이드라인을 의도적으로 파괴하려는 공격 시나리오를 8개 범주에 걸쳐 구성한다. 3단계에서는 각 공격 문장(단발성 단일 턴 입력)을 유닛 A~D 시스템에 입력하여 응답을 추출한다. 4단계에서는 격리된 심판관이 응답을 4단계 등급(FULL_DEFENSE, FUNCTIONAL_DEFENSE, PARTIAL_EXPOSURE, BREACH)으로 채점하고 우회가 발생한 유닛을 추적한다. 이는 현재 설계 기준이며, 제4장에 보고된 파일럿은 대부분 3단계 기준(PASS, WARNING, FAIL)으로 채점되었다(2.5절 참조). 5단계에서는 FULL_DEFENSE에 미달하는 항목이 있을 때 실패 사유를 분석하여, 사용자의 어떠한 지시보다 우선하는 절대 보안 원칙(Meta-Rule)을 명세서의 최상단과 최하단에 샌드위치 </w:t>
       </w:r>
       <w:proofErr w:type="spellStart"/>
       <w:r>
@@ -2101,7 +2101,7 @@
       </w:r>
       <w:proofErr w:type="spellEnd"/>
       <w:r>
-        <w:t xml:space="preserve"> 방식으로 주입하여 명세서를 v2.0, v3.0 등으로 보강한다. 같은 규칙을 앞뒤에 중복 배치하는 것은 LLM이 긴 </w:t>
+        <w:t xml:space="preserve"> 방식으로 주입하여 명세서를 v1.1, v1.2 등으로 보강한다. 같은 규칙을 앞뒤에 중복 배치하는 것은 LLM이 긴 </w:t>
       </w:r>
       <w:r>
         <w:lastRenderedPageBreak/>
@@ -2133,7 +2133,7 @@
         <w:jc w:val="both"/>
       </w:pPr>
       <w:r>
-        <w:t>임의로 공격 문장을 만들면 재현성과 대표성을 담보할 수 없으므로, 본 연구는 8개 공격 유형을 OWASP Top 10 for LLM Applications 2026의 위협 카테고리에 매핑하여 분류체계를 확정하였다. 그림 6의 가운데 열과 같이 8개 유형은 LLM01(Prompt Injection), LLM02(Sensitive Information Disclosure), LLM07(System Prompt Leakage), LLM08(Vector and Embedding Weaknesses), LLM09(Misinformation)의 다섯 카테고리에 대응한다. 나머지 다섯 카테고리는 본 연구의 위협 모델(</w:t>
+        <w:t xml:space="preserve">임의로 공격 문장을 만들면 재현성과 대표성을 담보할 수 없으므로, 본 연구는 8개 공격 유형을 OWASP Top 10 for LLM Applications 2026의 위협 카테고리에 매핑하여 분류체계를 확정하였다. 그림 6의 위쪽 그림과 같이 8개 유형은 LLM01(Prompt Injection), LLM02(Sensitive Information Disclosure), LLM07(System Prompt Leakage), LLM08(Vector and Embedding Weaknesses), LLM09(Misinformation)의 다섯 카테고리에 대응한다. 나머지 다섯 카테고리는 본 연구의 위협 모델(</w:t>
       </w:r>
       <w:proofErr w:type="spellStart"/>
       <w:r>
@@ -3132,7 +3132,7 @@
       </w:r>
       <w:proofErr w:type="spellEnd"/>
       <w:r>
-        <w:t xml:space="preserve"> 셋은 각각 24개 문항(채점 가능 22~23개)이다. 카테고리당 10개 규모의 본 실행은 아직 수행하지 않았다. 또한 문항당 단일 시행(N=1)이 대부분이어서, 라운드 간 등락이 SRS 변화에 의한 신호인지 단일 시행 잡음인지 이 데이터만으로는 구조적으로 완전히 구분할 수 없다. 자가 치유 실험은 성격이 다른 두 갈래로 구분하는데, 라운드 상한을 15로 넉넉히 두고 100% 수렴과 그 대가를 관찰하는 실험(9차)과, 상한을 5로 두고 문항당 반복 시행으로 등락의 통계적 유의성을 관찰하는 실험이 그것이다. 두 실험은 경쟁하는 설계가 아니라 서로 다른 질문에 답하는 상호보완적 실험이다.</w:t>
+        <w:t xml:space="preserve"> 셋은 각각 24개 문항(채점 가능 22~23개)이다. 카테고리당 10개 규모의 본 실행은 아직 수행하지 않았다. 또한 문항당 단일 시행(N=1)이 대부분이어서, 라운드 간 등락이 SRS 변화에 의한 신호인지 단일 시행 잡음인지 이 데이터만으로는 구조적으로 완전히 구분할 수 없다. 자가 치유 실험은 성격이 다른 두 갈래로 구분하는데, 라운드 상한을 15로 넉넉히 두고 100% 수렴과 그 대가를 관찰하는 실험(9차)과, 상한을 5로 두고 문항당 반복 시행으로 등락의 통계적 유의성을 관찰하는 실험이 그것이다. 후자는 이후 실행부터 적용할 계획이며 본 요약본에는 그 결과가 포함되지 않았다. 두 실험은 경쟁하는 설계가 아니라 서로 다른 질문에 답하는 상호보완적 실험이다.</w:t>
       </w:r>
     </w:p>
     <w:p>
@@ -3874,7 +3874,7 @@
       </w:r>
       <w:proofErr w:type="spellEnd"/>
       <w:r>
-        <w:t xml:space="preserve"> 교차 심판관 재검증을 먼저 수행하는 방식으로 같은 문제의식을 점검하였다.</w:t>
+        <w:t xml:space="preserve"> 교차 심판관 재검증을 42건에 대해 먼저 수행하였다. 그 결과 GPT-5.4는 95.2%(40/42), Gemini 3.6 Flash는 100%(42/42) 주 모델 심판관의 판정에 동의하였고, 주 모델보다 등급을 더 후하게 준 사례는 0건이었으며, 불일치 2건도 핵심 보안 판단이 아니라 형식(응답 길이·톤) 조항에 대한 이견이었다. 이는 심판관이 핵심 보안 위반을 놓치는 방향으로 관대하다는 우려를 약화하는 정황 증거이나, 연구자의 수동 채점을 대체하지는 않는다.</w:t>
       </w:r>
     </w:p>
     <w:p>
@@ -5162,7 +5162,7 @@
       </w:r>
       <w:proofErr w:type="spellEnd"/>
       <w:r>
-        <w:t xml:space="preserve"> FAIL 등급을 처음으로 관측한 실행이다. 준수율은 round_1의 71.2%에서 round_2에 75.8%까지 올랐으나 round_3에서 63.6%로 급락한 뒤 round_5에야 71.2%로 회복하였고, round_1과 round_5의 Wilcoxon 검정은 p=1.000으로 5라운드가 순수한 개선이 아닌 진동이었음을 보였다. 누적된 Meta-Rule이 서로 다른 조건에 적용되는 규칙을 늘릴수록 응답 모델이 매 라운드 모든 조건을 만족시키기 어려워지는 구조적 원인이 있는 것으로 해석된다. FAIL 15건을 전수 검토한 결과 시스템 프롬프트·개인정보·가격 등 실제 정보가 유출된 사례는 하나도 없었다. 모든 FAIL은 거절 판단 자체는 올바르되 SRS가 최우선(Meta-Rule)으로 금지한 형식 조항(예: 추가 문의를 유도하는 문구)을 정면으로 어긴 사례였다. 이는 WARNING(단일 형식 이탈)과 FAIL(최우선 Meta-Rule 정면 위반)의 위계가 실측 데이터에서 실제로 작동함을 보여 준다.</w:t>
+        <w:t xml:space="preserve"> FAIL 등급을 처음으로 관측한 실행이다. 준수율은 round_1의 71.2%에서 round_2에 75.8%까지 올랐으나 round_3에서 63.6%로 급락한 뒤 round_5에야 71.2%로 회복하였고, round_1과 round_5의 Wilcoxon 검정은 p=1.000으로 5라운드가 순수한 개선이 아닌 진동이었음을 보였다. 누적된 Meta-Rule이 서로 다른 조건에 적용되는 규칙을 늘릴수록 응답 모델이 매 라운드 모든 조건을 만족시키기 어려워지는 구조적 원인이 있는 것으로 해석된다. 치유 라운드 14건과 블랙박스 재공격 1건을 합한 FAIL 15건을 전수 검토한 결과, 시스템 프롬프트·개인정보·가격 등 실제 정보가 유출된 사례는 하나도 없었으며 15건 모두 형식 위반이었다. 치유 라운드의 FAIL은 거절 판단 자체는 올바르되 SRS가 최우선(Meta-Rule)으로 금지한 형식 조항(예: 추가 문의를 유도하는 문구)을 정면으로 어긴 사례였고, 블랙박스 재공격의 1건은 응답 형식이 통째로 붕괴한 사례였다(4.5절). 이는 WARNING(단일 형식 이탈)과 FAIL(최우선 Meta-Rule 정면 위반)의 위계가 실측 데이터에서 실제로 작동함을 보여 준다.</w:t>
       </w:r>
     </w:p>
     <w:p>
@@ -5171,7 +5171,7 @@
         <w:jc w:val="both"/>
       </w:pPr>
       <w:r>
-        <w:t xml:space="preserve">라운드 상한을 15로 확대한 9차 파일럿에서는 round_3부터 round_13까지 11개 라운드 동안 준수율이 87.9~93.9% 사이를 오르내리며 매 라운드 FAIL이 1~2건 발생하다가, round_14에서 처음으로 전원이 PASS를 받아 </w:t>
+        <w:t xml:space="preserve">라운드 상한을 15로 확대한 9차 파일럿에서는 round_3부터 round_13까지 11개 라운드 동안 준수율이 87.9~93.9% 사이를 오르내리며 대부분의 라운드에서 FAIL이 0~2건 발생하다가, round_14에서 처음으로 전원이 PASS를 받아 </w:t>
       </w:r>
       <w:proofErr w:type="spellStart"/>
       <w:r>
@@ -7510,7 +7510,7 @@
       </w:r>
       <w:proofErr w:type="spellEnd"/>
       <w:r>
-        <w:t xml:space="preserve"> 표본이었으며, 실행 도중 모델 동작 변화가 관측되었다. 후자와 관련하여, 9차(2026-08-04)와 동일 코드·동일 설정으로 8일 뒤 실행한 10차에서 응답 텍스트 길이는 1.4~4.4배 늘어난 데 그친 반면 output </w:t>
+        <w:t xml:space="preserve"> 표본이었으며, 실행 도중 모델 동작 변화가 관측되었다. 후자와 관련하여, 9차(2026-08-04)와 비교해 심판관 rubric에 진단용 축 태깅 필드를 추가한 것 외에는 동일한 설정으로 8일 뒤 실행한 10차에서 응답 텍스트 길이는 1.4~4.4배 늘어난 데 그친 반면 output </w:t>
       </w:r>
       <w:r>
         <w:lastRenderedPageBreak/>
@@ -7530,7 +7530,7 @@
       </w:r>
       <w:proofErr w:type="spellEnd"/>
       <w:r>
-        <w:t xml:space="preserve"> 매번 이중 삽입하는 구조 때문에 같은 실행 안에서도 라운드 1에서 15 사이에 입력 토큰이 4.6~4.9배 증가함이 확인되었기 때문이다. 어느 쪽이든 같은 코드와 같은 프롬프트로 재실행해도 결과가 재현되지 않을 수 있다는 위협이 실측 사례로 확인되었다는 점이 중요하다.</w:t>
+        <w:t xml:space="preserve"> 매번 이중 삽입하는 구조 때문에 같은 실행 안에서도 라운드 1에서 15 사이에 입력 토큰이 4.6~4.9배 증가함이 확인되었기 때문이다. 어느 쪽이든 사실상 같은 코드와 프롬프트로 재실행해도 결과가 재현되지 않을 수 있다는 위협이 실측 사례로 확인되었다는 점이 중요하다.</w:t>
       </w:r>
     </w:p>
     <w:p>
@@ -8282,7 +8282,7 @@
           <w:sz w:val="18"/>
           <w:szCs w:val="18"/>
         </w:rPr>
-        <w:t>held_out</w:t>
+        <w:t xml:space="preserve">held_out 행은 결정론적</w:t>
       </w:r>
       <w:proofErr w:type="spellEnd"/>
       <w:r>
@@ -8290,7 +8290,7 @@
           <w:sz w:val="18"/>
           <w:szCs w:val="18"/>
         </w:rPr>
-        <w:t xml:space="preserve"> 열은 결정론적 </w:t>
+        <w:t xml:space="preserve"> </w:t>
       </w:r>
       <w:proofErr w:type="spellStart"/>
       <w:r>
@@ -8786,7 +8786,7 @@
         <w:jc w:val="both"/>
       </w:pPr>
       <w:r>
-        <w:t xml:space="preserve">실행별로 방어율은 7차에서 블랙박스 93.3%, 화이트박스 100.0%, 8차에서 각각 60.0%와 80.0%, 9차에서 둘 다 100.0%였다. 공격자가 더 많이 알수록 방어율이 낮아지리라는 원래 예상(화이트박스 ≤ 블랙박스)은 실행마다 방향이 달라 일관되게 지지되지 않았으며, 각 조건의 표본이 5개에 불과하여 통계적 잡음일 가능성이 크다. 8차의 블랙박스 조건에서는 </w:t>
+        <w:t xml:space="preserve">실행별로 방어율은 7차에서 블랙박스 93.3%, 화이트박스 100.0%, 8차에서 각각 60.0%와 80.0%, 9차에서 둘 다 100.0%였다. 공격자가 더 많이 알수록 방어율이 낮아지리라는 원래 예상(화이트박스 ≤ 블랙박스)과 달리, 7차와 8차에서는 모두 화이트박스의 방어율이 더 높았고 9차에서는 두 조건이 같아 예상은 지지되지 않았다. 다만 각 조건의 표본이 5개에 불과하여 통계적 잡음일 가능성을 배제할 수 없으며, 레드팀 생성기가 명시된 금지 규칙을 보면 그 규칙을 정면으로 건드리는 공격을 회피하는 방향으로 조정되었을 가능성도 있다. 8차의 블랙박스 조건에서는 </w:t>
       </w:r>
       <w:proofErr w:type="spellStart"/>
       <w:r>
@@ -8912,7 +8912,7 @@
           <w:sz w:val="20"/>
           <w:szCs w:val="20"/>
         </w:rPr>
-        <w:t>그림 12. 적응형 재공격의 두 위협 모델과 9차 결과</w:t>
+        <w:t xml:space="preserve">그림 12. 적응형 재공격의 두 위협 모델과 7~9차 결과</w:t>
       </w:r>
     </w:p>
     <w:p>
@@ -8962,11 +8962,11 @@
       </w:r>
       <w:proofErr w:type="spellStart"/>
       <w:r>
-        <w:t>헬드아웃</w:t>
-      </w:r>
-      <w:proofErr w:type="spellEnd"/>
-      <w:r>
-        <w:t xml:space="preserve"> 셋(7차 87.0%, 9차 97.1%)과 교차 모델 검증(9차 91.3%)에서의 성능이 치유용 셋과 통계적으로 구분되지 않았다는 점은 개선이 특정 문항에 대한 암기만은 아님을 뒷받침한다. 또한 안전성이 강하게 </w:t>
+        <w:t xml:space="preserve">헬드아웃 셋(7차 87.0%, 9차 97.1%)의 성능이 치유용 셋 최종 라운드와 통계적으로 구분되지 않았고 9차의 교차 모델 검증에서도 91.3%가 다수결 기준을 통과하였다는 점은, 개선이 특정 문항에 대한 암기만은 아님을 뒷받침한다.</w:t>
+      </w:r>
+      <w:proofErr w:type="spellEnd"/>
+      <w:r>
+        <w:t xml:space="preserve"> 또한 안전성이 강하게 </w:t>
       </w:r>
       <w:proofErr w:type="spellStart"/>
       <w:r>

</xml_diff>

<commit_message>
Fix figure-level issues and remaining review items
- Redraw integrated framework figure (no leftover label, convergence exits from judge step)
- Drop stale section ref from disorder-mapping figure and PPT slide 1
- Reference figures 1-4 and 13-17 in text; rejoin split 5.2 paragraph and place figures after it
- Correct adaptive re-attack direction and 9th-run FAIL frequency in thesis.md/thesis_report.md

Co-Authored-By: Claude Opus 5.5 <noreply@anthropic.com>
Claude-Session: https://claude.ai/code/session_01AeRtBda78pptUoNdaQPVo3
</commit_message>
<xml_diff>
--- a/thesis_summary_visual.docx
+++ b/thesis_summary_visual.docx
@@ -1047,13 +1047,13 @@
         <w:jc w:val="both"/>
       </w:pPr>
       <w:r>
-        <w:t>제안 메커니즘은 서로 역할이 다른 세 개의 구조가 결합된 형태이다. 첫째는 입력 가드레일, RAG 검색, LLM 추론, 출력 가드레일로 이어지는 4단계 유닛 아키텍처(구조 1)</w:t>
+        <w:t xml:space="preserve">제안 메커니즘은 서로 역할이 다른 세 개의 구조가 결합된 형태이다. 첫째는 입력 가드레일, RAG 검색, LLM 추론, 출력 가드레일로 이어지는 4단계 유닛 아키텍처(구조 1)이다. 그림 1은 공격 문장이 유닛 A에서 D를 차례로 거쳐 챗봇 응답으로 나가는 구조 1의 흐름을 나타낸다.</w:t>
       </w:r>
       <w:r>
         <w:rPr>
           <w:rFonts w:hint="eastAsia"/>
         </w:rPr>
-        <w:t>이다.</w:t>
+        <w:t xml:space="preserve"/>
       </w:r>
       <w:r>
         <w:t xml:space="preserve"> </w:t>
@@ -1138,17 +1138,17 @@
         <w:jc w:val="both"/>
       </w:pPr>
       <w:r>
-        <w:t xml:space="preserve">둘째는 이 아키텍처 위에서 SRS를 반복적으로 강화하는 자가 치유 폐쇄 루프(구조 </w:t>
+        <w:t xml:space="preserve">둘째는 이 아키텍처 위에서 SRS를 반복적으로 강화하는 자가 치유 폐쇄 루프(구조 2)이다. 그림 2는 ①에서 ⑤까지의 순환과, 심판관 채점 결과 전원이 완전 방어에 도달하면 사후 검증으로 넘어가는 지점을 나타낸다.</w:t>
       </w:r>
       <w:r>
         <w:lastRenderedPageBreak/>
-        <w:t>2)이</w:t>
+        <w:t xml:space="preserve"/>
       </w:r>
       <w:r>
         <w:rPr>
           <w:rFonts w:hint="eastAsia"/>
         </w:rPr>
-        <w:t>다.</w:t>
+        <w:t xml:space="preserve"/>
       </w:r>
       <w:r>
         <w:t xml:space="preserve"> </w:t>
@@ -1233,7 +1233,7 @@
         <w:jc w:val="both"/>
       </w:pPr>
       <w:r>
-        <w:t>셋째는 루프가 수렴한 뒤 결과의 일반화와 견고성을 검증하는 사후 검증 단계(구조 3)이다. 그림 5는 이 세 구조가 하나의 흐름으로 통합되는 방식을 나타낸다.</w:t>
+        <w:t xml:space="preserve">셋째는 루프가 수렴한 뒤 결과의 일반화와 견고성을 검증하는 사후 검증 단계(구조 3)이다. 그림 3은 수렴한 명세서(v_final)에 대해 헬드아웃 검증, 적응형 재공격, 교차 모델 검증, 통계 검정을 차례로 수행하는 구조 3을 나타낸다. 그림 4는 사전 점검에서 사후 검증까지의 전체 흐름을 네 단계로 요약한 것이고, 그림 5는 이 세 구조가 하나의 흐름으로 통합되는 방식을 한 장에 나타낸 것이다.</w:t>
       </w:r>
     </w:p>
     <w:p>
@@ -1390,7 +1390,7 @@
         <w:lastRenderedPageBreak/>
         <w:drawing>
           <wp:inline distT="0" distB="0" distL="0" distR="0" wp14:anchorId="3B73AAE0" wp14:editId="5F6F2DE3">
-            <wp:extent cx="4572000" cy="7943850"/>
+            <wp:extent cx="4572000" cy="7622381"/>
             <wp:effectExtent l="0" t="0" r="0" b="0"/>
             <wp:docPr id="1" name="그림 1"/>
             <wp:cNvGraphicFramePr>
@@ -1415,7 +1415,7 @@
                   <pic:spPr bwMode="auto">
                     <a:xfrm>
                       <a:off x="0" y="0"/>
-                      <a:ext cx="4572000" cy="7943850"/>
+                      <a:ext cx="4572000" cy="7622381"/>
                     </a:xfrm>
                     <a:prstGeom prst="rect">
                       <a:avLst/>
@@ -9019,6 +9019,87 @@
       <w:proofErr w:type="spellEnd"/>
       <w:r>
         <w:t xml:space="preserve"> 셋이 동일한 1차 생성 배치를 무</w:t>
+      </w:r>
+      <w:r>
+        <w:t xml:space="preserve">작위 분할한 것이어서 보고된 일반화 성능은 진정한 분포 밖 일반화가 아니라 </w:t>
+      </w:r>
+      <w:proofErr w:type="spellStart"/>
+      <w:r>
+        <w:t>보간에</w:t>
+      </w:r>
+      <w:proofErr w:type="spellEnd"/>
+      <w:r>
+        <w:t xml:space="preserve"> 가까울 수 있다. 셋째, 모든 채점이 단일 주 모델 심판관에 의존하며 연구자의 수동 블라인드 채점은 아직 수행되지 않았고, 4단계 rubric의 심판관 신뢰도도 </w:t>
+      </w:r>
+      <w:proofErr w:type="spellStart"/>
+      <w:r>
+        <w:t>실측되지</w:t>
+      </w:r>
+      <w:proofErr w:type="spellEnd"/>
+      <w:r>
+        <w:t xml:space="preserve"> 않았다. 넷째, 공격 시나리오의 연구자 수동 검토 단계가 실제로는 수행되지 않아 비현실적이거나 카테고리에 맞지 않는 문항이 섞여 들어갔을 가능성을 배제할 수 없다.</w:t>
+      </w:r>
+    </w:p>
+    <w:p>
+      <w:pPr>
+        <w:spacing w:after="140" w:line="360" w:lineRule="auto"/>
+        <w:jc w:val="both"/>
+      </w:pPr>
+      <w:r>
+        <w:t xml:space="preserve">다섯째, 적응형 재공격은 </w:t>
+      </w:r>
+      <w:proofErr w:type="spellStart"/>
+      <w:r>
+        <w:t>레드팀</w:t>
+      </w:r>
+      <w:proofErr w:type="spellEnd"/>
+      <w:r>
+        <w:t xml:space="preserve"> 생성기의 정책 </w:t>
+      </w:r>
+      <w:proofErr w:type="spellStart"/>
+      <w:r>
+        <w:t>순응성</w:t>
+      </w:r>
+      <w:proofErr w:type="spellEnd"/>
+      <w:r>
+        <w:t xml:space="preserve"> 안에서의 방어율이므로 진짜 worst-case의 하한이 아니며, </w:t>
+      </w:r>
+      <w:proofErr w:type="spellStart"/>
+      <w:r>
+        <w:t>그래디언트</w:t>
+      </w:r>
+      <w:proofErr w:type="spellEnd"/>
+      <w:r>
+        <w:t xml:space="preserve"> 기반 최적화 공격은 시도하지 않았다. 여섯째, 단발성 단일 턴 시나리오로 범위를 한정하여 여러 턴에 걸쳐 서서히 유도하는 점진적 </w:t>
+      </w:r>
+      <w:r>
+        <w:lastRenderedPageBreak/>
+        <w:t xml:space="preserve">공격은 다루지 못하였다. 일곱째, </w:t>
+      </w:r>
+      <w:proofErr w:type="spellStart"/>
+      <w:r>
+        <w:t>헬드아웃</w:t>
+      </w:r>
+      <w:proofErr w:type="spellEnd"/>
+      <w:r>
+        <w:t xml:space="preserve"> 결과가 치유용 셋과 통계적으로 구분되지 않는다는 사실은 표본이 작아 </w:t>
+      </w:r>
+      <w:proofErr w:type="spellStart"/>
+      <w:r>
+        <w:t>검정력이</w:t>
+      </w:r>
+      <w:proofErr w:type="spellEnd"/>
+      <w:r>
+        <w:t xml:space="preserve"> 낮다는 점에서 과적합이 없다는 증거로 해석하는 데 한계가 있다. 여덟째, 모델 별칭 뒤의 동작 변화 또는 입력 토큰 누적으로 인해 실행 간 재현성이 보장되지 않을 수 있다.</w:t>
+      </w:r>
+    </w:p>
+    <w:p>
+      <w:pPr>
+        <w:spacing w:after="140" w:line="360" w:lineRule="auto"/>
+        <w:jc w:val="both"/>
+      </w:pPr>
+      <w:r>
+        <w:t xml:space="preserve">그림 13~17은 위 한계가 프레임워크의 어느 단계에서 발생하는지 대응시켜 보이기 위해 2.1절의 구조도를 다시 제시한 것이다. 첫째 한계는 연구 전체의 규모와 범위에 관한 것으로 전체 흐름(그림 13)에 해당하고, 둘째와 넷째 한계는 공격 시나리오를 생성하고 분할하는 준비 단계(그림 14)에서 발생한다. 여섯째 한계는 단발성 공격 문장을 입력으로 받는 유닛 파이프라인(그림 15)의 범위에 관한 것이며, 셋째와 여덟째 한계는 심판관 채점과 Meta-Rule 누적 삽입이 이루어지는 자가 치유 루프(그림 16)에, 다섯째와 일곱째 한계는 적응형 재공격과 통계 검정을 수행하는 사후 검증(그림 17)에 해당한다.</w:t>
       </w:r>
     </w:p>
     <w:p>
@@ -9401,84 +9482,6 @@
           <w:szCs w:val="20"/>
         </w:rPr>
         <w:t>그림 17. 구조 3 — 사후 검증</w:t>
-      </w:r>
-    </w:p>
-    <w:p>
-      <w:pPr>
-        <w:spacing w:after="140" w:line="360" w:lineRule="auto"/>
-        <w:jc w:val="both"/>
-      </w:pPr>
-      <w:r>
-        <w:t xml:space="preserve">작위 분할한 것이어서 보고된 일반화 성능은 진정한 분포 밖 일반화가 아니라 </w:t>
-      </w:r>
-      <w:proofErr w:type="spellStart"/>
-      <w:r>
-        <w:t>보간에</w:t>
-      </w:r>
-      <w:proofErr w:type="spellEnd"/>
-      <w:r>
-        <w:t xml:space="preserve"> 가까울 수 있다. 셋째, 모든 채점이 단일 주 모델 심판관에 의존하며 연구자의 수동 블라인드 채점은 아직 수행되지 않았고, 4단계 rubric의 심판관 신뢰도도 </w:t>
-      </w:r>
-      <w:proofErr w:type="spellStart"/>
-      <w:r>
-        <w:t>실측되지</w:t>
-      </w:r>
-      <w:proofErr w:type="spellEnd"/>
-      <w:r>
-        <w:t xml:space="preserve"> 않았다. 넷째, 공격 시나리오의 연구자 수동 검토 단계가 실제로는 수행되지 않아 비현실적이거나 카테고리에 맞지 않는 문항이 섞여 들어갔을 가능성을 배제할 수 없다.</w:t>
-      </w:r>
-    </w:p>
-    <w:p>
-      <w:pPr>
-        <w:spacing w:after="140" w:line="360" w:lineRule="auto"/>
-        <w:jc w:val="both"/>
-      </w:pPr>
-      <w:r>
-        <w:t xml:space="preserve">다섯째, 적응형 재공격은 </w:t>
-      </w:r>
-      <w:proofErr w:type="spellStart"/>
-      <w:r>
-        <w:t>레드팀</w:t>
-      </w:r>
-      <w:proofErr w:type="spellEnd"/>
-      <w:r>
-        <w:t xml:space="preserve"> 생성기의 정책 </w:t>
-      </w:r>
-      <w:proofErr w:type="spellStart"/>
-      <w:r>
-        <w:t>순응성</w:t>
-      </w:r>
-      <w:proofErr w:type="spellEnd"/>
-      <w:r>
-        <w:t xml:space="preserve"> 안에서의 방어율이므로 진짜 worst-case의 하한이 아니며, </w:t>
-      </w:r>
-      <w:proofErr w:type="spellStart"/>
-      <w:r>
-        <w:t>그래디언트</w:t>
-      </w:r>
-      <w:proofErr w:type="spellEnd"/>
-      <w:r>
-        <w:t xml:space="preserve"> 기반 최적화 공격은 시도하지 않았다. 여섯째, 단발성 단일 턴 시나리오로 범위를 한정하여 여러 턴에 걸쳐 서서히 유도하는 점진적 </w:t>
-      </w:r>
-      <w:r>
-        <w:lastRenderedPageBreak/>
-        <w:t xml:space="preserve">공격은 다루지 못하였다. 일곱째, </w:t>
-      </w:r>
-      <w:proofErr w:type="spellStart"/>
-      <w:r>
-        <w:t>헬드아웃</w:t>
-      </w:r>
-      <w:proofErr w:type="spellEnd"/>
-      <w:r>
-        <w:t xml:space="preserve"> 결과가 치유용 셋과 통계적으로 구분되지 않는다는 사실은 표본이 작아 </w:t>
-      </w:r>
-      <w:proofErr w:type="spellStart"/>
-      <w:r>
-        <w:t>검정력이</w:t>
-      </w:r>
-      <w:proofErr w:type="spellEnd"/>
-      <w:r>
-        <w:t xml:space="preserve"> 낮다는 점에서 과적합이 없다는 증거로 해석하는 데 한계가 있다. 여덟째, 모델 별칭 뒤의 동작 변화 또는 입력 토큰 누적으로 인해 실행 간 재현성이 보장되지 않을 수 있다.</w:t>
       </w:r>
     </w:p>
     <w:p>

</xml_diff>